<commit_message>
court(ptab) patent-owner-response: typst/docx on the shared cross-engine layout model; XENG-001..003 pass on docx, params.cross_engine: gate (fb-595.54.6)
</commit_message>
<xml_diff>
--- a/courts/federal-circuit/patent-trial-and-appeal-board/patent-owner-response/docx/reference.docx
+++ b/courts/federal-circuit/patent-trial-and-appeal-board/patent-owner-response/docx/reference.docx
@@ -314,9 +314,9 @@
       </w:r>
     </w:p>
     <w:sectPr>
-      <w:footnotePr>
-        <w:numRestart w:val="eachSect"/>
-      </w:footnotePr>
+      <w:footerReference w:type="default" r:id="rIdFooter1"/>
+      <w:pgSz w:w="12240" w:h="15840"/>
+      <w:pgMar w:top="1440" w:right="1440" w:bottom="1440" w:left="1440" w:header="720" w:footer="432" w:gutter="0"/>
     </w:sectPr>
   </w:body>
 </w:document>
@@ -324,6 +324,31 @@
 
 <file path=word/comments.xml><?xml version="1.0" encoding="utf-8"?>
 <w:comments xmlns:w="http://schemas.openxmlformats.org/wordprocessingml/2006/main" xmlns:m="http://schemas.openxmlformats.org/officeDocument/2006/math" xmlns:r="http://schemas.openxmlformats.org/officeDocument/2006/relationships" xmlns:o="urn:schemas-microsoft-com:office:office" xmlns:v="urn:schemas-microsoft-com:vml" xmlns:w10="urn:schemas-microsoft-com:office:word" xmlns:a="http://schemas.openxmlformats.org/drawingml/2006/main" xmlns:pic="http://schemas.openxmlformats.org/drawingml/2006/picture" xmlns:wp="http://schemas.openxmlformats.org/drawingml/2006/wordprocessingDrawing"/>
+</file>
+
+<file path=word/footer1.xml><?xml version="1.0" encoding="utf-8"?>
+<w:ftr xmlns:w="http://schemas.openxmlformats.org/wordprocessingml/2006/main" xmlns:r="http://schemas.openxmlformats.org/officeDocument/2006/relationships">
+  <w:p>
+    <w:pPr>
+      <w:jc w:val="center"/>
+    </w:pPr>
+    <w:r>
+      <w:fldChar w:fldCharType="begin"/>
+    </w:r>
+    <w:r>
+      <w:instrText xml:space="preserve"> PAGE </w:instrText>
+    </w:r>
+    <w:r>
+      <w:fldChar w:fldCharType="separate"/>
+    </w:r>
+    <w:r>
+      <w:t>1</w:t>
+    </w:r>
+    <w:r>
+      <w:fldChar w:fldCharType="end"/>
+    </w:r>
+  </w:p>
+</w:ftr>
 </file>
 
 <file path=word/footnotes.xml><?xml version="1.0" encoding="utf-8"?>
@@ -474,103 +499,589 @@
       </w:pPr>
     </w:lvl>
   </w:abstractNum>
-  <w:abstractNum w:abstractNumId="901">
-    <w:multiLevelType w:val="multilevel"/>
-    <w:lvl w:ilvl="0">
-      <w:start w:val="1"/>
-      <w:numFmt w:val="upperRoman"/>
-      <w:pStyle w:val="Heading1"/>
-      <w:suff w:val="space"/>
-      <w:lvlText w:val="%1."/>
-      <w:lvlJc w:val="left"/>
-      <w:pPr>
-        <w:ind w:left="0" w:firstLine="0"/>
-      </w:pPr>
-    </w:lvl>
-    <w:lvl w:ilvl="1">
-      <w:start w:val="1"/>
-      <w:numFmt w:val="upperLetter"/>
-      <w:pStyle w:val="Heading2"/>
-      <w:suff w:val="space"/>
-      <w:lvlText w:val="%2."/>
-      <w:lvlJc w:val="left"/>
-      <w:pPr>
-        <w:ind w:left="0" w:firstLine="0"/>
-      </w:pPr>
-    </w:lvl>
-    <w:lvl w:ilvl="2">
-      <w:start w:val="1"/>
-      <w:numFmt w:val="decimal"/>
-      <w:pStyle w:val="Heading3"/>
-      <w:suff w:val="space"/>
-      <w:lvlText w:val="%3."/>
-      <w:lvlJc w:val="left"/>
-      <w:pPr>
-        <w:ind w:left="0" w:firstLine="0"/>
-      </w:pPr>
-    </w:lvl>
-    <w:lvl w:ilvl="3">
-      <w:start w:val="1"/>
-      <w:numFmt w:val="lowerLetter"/>
-      <w:pStyle w:val="Heading4"/>
-      <w:suff w:val="space"/>
-      <w:lvlText w:val="%4."/>
-      <w:lvlJc w:val="left"/>
-      <w:pPr>
-        <w:ind w:left="0" w:firstLine="0"/>
-      </w:pPr>
-    </w:lvl>
-  </w:abstractNum>
   <w:num w:numId="1000">
     <w:abstractNumId w:val="990"/>
-  </w:num>
-  <w:num w:numId="901">
-    <w:abstractNumId w:val="901"/>
   </w:num>
 </w:numbering>
 </file>
 
 <file path=word/styles.xml><?xml version="1.0" encoding="utf-8"?>
-<!-- docx/styles.xml: the paragraph and character styles of the PTAB patent owner response (see make-reference.sh).
-     Mirrors typst/ptab-patent-owner-response.typ: 14-point Times New Roman (37 C.F.R. 42.6(a)(2)(ii)), double
-     spacing for the body (42.6(a)(2)(iii)), single spacing for headings, cover, contents, certificates and footnotes.
-     Sizes are in half-points (w:sz), spacing in twentieths of a point (twips). Heading numbers (I., A., 1.) come from
-     the list numId 901 that make-reference.sh adds to numbering.xml. -->
-<w:styles xmlns:w="http://schemas.openxmlformats.org/wordprocessingml/2006/main" xmlns:r="http://schemas.openxmlformats.org/officeDocument/2006/relationships">
+<w:styles xmlns:r="http://schemas.openxmlformats.org/officeDocument/2006/relationships" xmlns:w="http://schemas.openxmlformats.org/wordprocessingml/2006/main">
   <w:docDefaults>
     <w:rPrDefault>
       <w:rPr>
         <w:rFonts w:ascii="Times New Roman" w:hAnsi="Times New Roman" w:eastAsia="Times New Roman" w:cs="Times New Roman"/>
         <w:sz w:val="28"/>
         <w:szCs w:val="28"/>
-        <w:lang w:val="en-US" w:eastAsia="en-US" w:bidi="ar-SA"/>
+        <w:lang w:val="en-US" w:eastAsia="zh-CN" w:bidi="ar-SA"/>
       </w:rPr>
     </w:rPrDefault>
     <w:pPrDefault>
       <w:pPr>
-        <w:spacing w:after="0" w:line="240" w:lineRule="auto"/>
+        <w:widowControl/>
+        <w:spacing w:after="0"/>
       </w:pPr>
     </w:pPrDefault>
   </w:docDefaults>
+  <w:latentStyles w:defLockedState="0" w:defUIPriority="0" w:defSemiHidden="0" w:defUnhideWhenUsed="0" w:defQFormat="0" w:count="276"/>
   <w:style w:type="paragraph" w:default="1" w:styleId="Normal">
     <w:name w:val="Normal"/>
     <w:qFormat/>
-    <w:pPr>
-      <w:widowControl/>
-      <w:spacing w:before="0" w:after="0" w:line="240" w:lineRule="auto"/>
+  </w:style>
+  <w:style w:type="paragraph" w:styleId="BodyText">
+    <w:name w:val="Body Text"/>
+    <w:basedOn w:val="Normal"/>
+    <w:link w:val="BodyTextChar"/>
+    <w:qFormat/>
+    <w:pPr>
+      <w:spacing w:before="0" w:after="0" w:line="640" w:lineRule="exact"/>
+      <w:ind w:firstLine="720"/>
+    </w:pPr>
+  </w:style>
+  <w:style w:type="paragraph" w:customStyle="1" w:styleId="FirstParagraph">
+    <w:name w:val="First Paragraph"/>
+    <w:basedOn w:val="BodyText"/>
+    <w:next w:val="BodyText"/>
+    <w:qFormat/>
+  </w:style>
+  <w:style w:type="paragraph" w:customStyle="1" w:styleId="Compact">
+    <w:name w:val="Compact"/>
+    <w:basedOn w:val="BodyText"/>
+    <w:qFormat/>
+    <w:pPr>
+      <w:spacing w:before="36" w:after="36"/>
+    </w:pPr>
+  </w:style>
+  <w:style w:type="paragraph" w:styleId="Title">
+    <w:name w:val="Title"/>
+    <w:basedOn w:val="Normal"/>
+    <w:next w:val="BodyText"/>
+    <w:link w:val="TitleChar"/>
+    <w:uiPriority w:val="10"/>
+    <w:qFormat/>
+    <w:rsid w:val="00A10FD9"/>
+    <w:pPr>
+      <w:spacing w:after="80" w:line="240" w:lineRule="auto"/>
+      <w:contextualSpacing/>
+      <w:jc w:val="center"/>
+    </w:pPr>
+    <w:rPr>
+      <w:rFonts w:asciiTheme="majorHAnsi" w:eastAsiaTheme="majorEastAsia" w:hAnsiTheme="majorHAnsi" w:cstheme="majorBidi"/>
+      <w:sz w:val="56"/>
+      <w:szCs w:val="56"/>
+    </w:rPr>
+  </w:style>
+  <w:style w:type="character" w:customStyle="1" w:styleId="TitleChar">
+    <w:name w:val="Title Char"/>
+    <w:basedOn w:val="DefaultParagraphFont"/>
+    <w:link w:val="Title"/>
+    <w:uiPriority w:val="10"/>
+    <w:rsid w:val="00A10FD9"/>
+    <w:rPr>
+      <w:rFonts w:asciiTheme="majorHAnsi" w:eastAsiaTheme="majorEastAsia" w:hAnsiTheme="majorHAnsi" w:cstheme="majorBidi"/>
+      <w:sz w:val="56"/>
+      <w:szCs w:val="56"/>
+    </w:rPr>
+  </w:style>
+  <w:style w:type="paragraph" w:styleId="Subtitle">
+    <w:name w:val="Subtitle"/>
+    <w:basedOn w:val="Title"/>
+    <w:next w:val="BodyText"/>
+    <w:link w:val="SubtitleChar"/>
+    <w:uiPriority w:val="11"/>
+    <w:qFormat/>
+    <w:rsid w:val="00A10FD9"/>
+    <w:pPr>
+      <w:numPr>
+        <w:ilvl w:val="1"/>
+      </w:numPr>
+    </w:pPr>
+    <w:rPr>
+      <w:rFonts w:eastAsiaTheme="majorEastAsia" w:cstheme="majorBidi"/>
+      <w:spacing w:val="15"/>
+      <w:sz w:val="28"/>
+      <w:szCs w:val="28"/>
+    </w:rPr>
+  </w:style>
+  <w:style w:type="character" w:customStyle="1" w:styleId="SubtitleChar">
+    <w:name w:val="Subtitle Char"/>
+    <w:basedOn w:val="DefaultParagraphFont"/>
+    <w:link w:val="Subtitle"/>
+    <w:uiPriority w:val="11"/>
+    <w:rsid w:val="00A10FD9"/>
+    <w:rPr>
+      <w:rFonts w:eastAsiaTheme="majorEastAsia" w:cstheme="majorBidi"/>
+      <w:color w:val="595959" w:themeColor="text1" w:themeTint="A6"/>
+      <w:spacing w:val="15"/>
+      <w:sz w:val="28"/>
+      <w:szCs w:val="28"/>
+    </w:rPr>
+  </w:style>
+  <w:style w:type="paragraph" w:customStyle="1" w:styleId="Author">
+    <w:name w:val="Author"/>
+    <w:basedOn w:val="Title"/>
+    <w:next w:val="BodyText"/>
+    <w:qFormat/>
+    <w:pPr>
+      <w:keepNext/>
+      <w:keepLines/>
+    </w:pPr>
+    <w:rPr>
+      <w:sz w:val="24"/>
+      <w:szCs w:val="24"/>
+    </w:rPr>
+  </w:style>
+  <w:style w:type="paragraph" w:styleId="Date">
+    <w:name w:val="Date"/>
+    <w:basedOn w:val="Title"/>
+    <w:next w:val="BodyText"/>
+    <w:qFormat/>
+    <w:pPr>
+      <w:keepNext/>
+      <w:keepLines/>
+    </w:pPr>
+    <w:rPr>
+      <w:sz w:val="24"/>
+      <w:szCs w:val="24"/>
+    </w:rPr>
+  </w:style>
+  <w:style w:type="paragraph" w:customStyle="1" w:styleId="AbstractTitle">
+    <w:name w:val="Abstract Title"/>
+    <w:basedOn w:val="Normal"/>
+    <w:next w:val="Abstract"/>
+    <w:qFormat/>
+    <w:pPr>
+      <w:keepNext/>
+      <w:keepLines/>
+      <w:spacing w:before="300" w:after="0"/>
+      <w:jc w:val="center"/>
+    </w:pPr>
+    <w:rPr>
+      <w:b/>
+      <w:sz w:val="20"/>
+      <w:szCs w:val="20"/>
+    </w:rPr>
+  </w:style>
+  <w:style w:type="paragraph" w:customStyle="1" w:styleId="Abstract">
+    <w:name w:val="Abstract"/>
+    <w:basedOn w:val="Normal"/>
+    <w:next w:val="BodyText"/>
+    <w:qFormat/>
+    <w:pPr>
+      <w:keepNext/>
+      <w:keepLines/>
+      <w:spacing w:before="100" w:after="300"/>
+    </w:pPr>
+    <w:rPr>
+      <w:sz w:val="20"/>
+      <w:szCs w:val="20"/>
+    </w:rPr>
+  </w:style>
+  <w:style w:type="paragraph" w:styleId="Bibliography">
+    <w:name w:val="Bibliography"/>
+    <w:basedOn w:val="Normal"/>
+    <w:next w:val="Bibliography"/>
+    <w:qFormat/>
+    <w:pPr/>
+    <w:rPr/>
+  </w:style>
+  <w:style w:type="paragraph" w:styleId="Heading1">
+    <w:name w:val="heading 1"/>
+    <w:basedOn w:val="Normal"/>
+    <w:next w:val="BodyText"/>
+    <w:link w:val="Heading1Char"/>
+    <w:uiPriority w:val="9"/>
+    <w:qFormat/>
+    <w:rsid w:val="00A10FD9"/>
+    <w:pPr>
+      <w:keepNext/>
+      <w:keepLines/>
+      <w:spacing w:before="240" w:after="120" w:line="320" w:lineRule="exact"/>
+      <w:ind w:firstLine="0"/>
+      <w:jc w:val="center"/>
+      <w:outlineLvl w:val="0"/>
+    </w:pPr>
+    <w:rPr>
+      <w:rFonts w:ascii="Times New Roman" w:hAnsi="Times New Roman" w:eastAsia="Times New Roman" w:cs="Times New Roman"/>
+      <w:b/>
+      <w:bCs/>
+      <w:caps/>
+      <w:color w:val="000000"/>
+      <w:sz w:val="28"/>
+      <w:szCs w:val="28"/>
+    </w:rPr>
+  </w:style>
+  <w:style w:type="paragraph" w:styleId="Heading2">
+    <w:name w:val="heading 2"/>
+    <w:basedOn w:val="Normal"/>
+    <w:next w:val="BodyText"/>
+    <w:link w:val="Heading2Char"/>
+    <w:uiPriority w:val="9"/>
+    <w:semiHidden/>
+    <w:unhideWhenUsed/>
+    <w:qFormat/>
+    <w:rsid w:val="00A10FD9"/>
+    <w:pPr>
+      <w:keepNext/>
+      <w:keepLines/>
+      <w:spacing w:before="240" w:after="120" w:line="320" w:lineRule="exact"/>
+      <w:ind w:firstLine="0"/>
+      <w:outlineLvl w:val="1"/>
+    </w:pPr>
+    <w:rPr>
+      <w:rFonts w:ascii="Times New Roman" w:hAnsi="Times New Roman" w:eastAsia="Times New Roman" w:cs="Times New Roman"/>
+      <w:b/>
+      <w:bCs/>
+      <w:color w:val="000000"/>
+      <w:sz w:val="28"/>
+      <w:szCs w:val="28"/>
+    </w:rPr>
+  </w:style>
+  <w:style w:type="paragraph" w:styleId="Heading3">
+    <w:name w:val="heading 3"/>
+    <w:basedOn w:val="Normal"/>
+    <w:next w:val="BodyText"/>
+    <w:link w:val="Heading3Char"/>
+    <w:uiPriority w:val="9"/>
+    <w:semiHidden/>
+    <w:unhideWhenUsed/>
+    <w:qFormat/>
+    <w:rsid w:val="00A10FD9"/>
+    <w:pPr>
+      <w:keepNext/>
+      <w:keepLines/>
+      <w:spacing w:before="240" w:after="120" w:line="320" w:lineRule="exact"/>
+      <w:ind w:firstLine="0"/>
+      <w:outlineLvl w:val="2"/>
+    </w:pPr>
+    <w:rPr>
+      <w:rFonts w:ascii="Times New Roman" w:hAnsi="Times New Roman" w:eastAsia="Times New Roman" w:cs="Times New Roman"/>
+      <w:b/>
+      <w:bCs/>
+      <w:color w:val="000000"/>
+      <w:sz w:val="28"/>
+      <w:szCs w:val="28"/>
+    </w:rPr>
+  </w:style>
+  <w:style w:type="paragraph" w:styleId="Heading4">
+    <w:name w:val="heading 4"/>
+    <w:basedOn w:val="Normal"/>
+    <w:next w:val="BodyText"/>
+    <w:link w:val="Heading4Char"/>
+    <w:uiPriority w:val="9"/>
+    <w:semiHidden/>
+    <w:unhideWhenUsed/>
+    <w:qFormat/>
+    <w:rsid w:val="00A10FD9"/>
+    <w:pPr>
+      <w:keepNext/>
+      <w:keepLines/>
+      <w:spacing w:before="240" w:after="120" w:line="320" w:lineRule="exact"/>
+      <w:ind w:firstLine="0"/>
+      <w:outlineLvl w:val="3"/>
+    </w:pPr>
+    <w:rPr>
+      <w:rFonts w:ascii="Times New Roman" w:hAnsi="Times New Roman" w:eastAsia="Times New Roman" w:cs="Times New Roman"/>
+      <w:b/>
+      <w:bCs/>
+      <w:i/>
+      <w:color w:val="000000"/>
+      <w:sz w:val="28"/>
+      <w:szCs w:val="28"/>
+    </w:rPr>
+  </w:style>
+  <w:style w:type="paragraph" w:styleId="Heading5">
+    <w:name w:val="heading 5"/>
+    <w:basedOn w:val="Normal"/>
+    <w:next w:val="BodyText"/>
+    <w:link w:val="Heading5Char"/>
+    <w:uiPriority w:val="9"/>
+    <w:semiHidden/>
+    <w:unhideWhenUsed/>
+    <w:qFormat/>
+    <w:rsid w:val="00A10FD9"/>
+    <w:pPr>
+      <w:keepNext/>
+      <w:keepLines/>
+      <w:spacing w:before="240" w:after="120" w:line="320" w:lineRule="exact"/>
+      <w:ind w:firstLine="0"/>
+      <w:outlineLvl w:val="4"/>
+    </w:pPr>
+    <w:rPr>
+      <w:rFonts w:ascii="Times New Roman" w:hAnsi="Times New Roman" w:eastAsia="Times New Roman" w:cs="Times New Roman"/>
+      <w:b/>
+      <w:bCs/>
+      <w:i/>
+      <w:color w:val="000000"/>
+      <w:sz w:val="28"/>
+      <w:szCs w:val="28"/>
+    </w:rPr>
+  </w:style>
+  <w:style w:type="paragraph" w:styleId="Heading6">
+    <w:name w:val="heading 6"/>
+    <w:basedOn w:val="Normal"/>
+    <w:next w:val="BodyText"/>
+    <w:link w:val="Heading6Char"/>
+    <w:uiPriority w:val="9"/>
+    <w:semiHidden/>
+    <w:unhideWhenUsed/>
+    <w:qFormat/>
+    <w:rsid w:val="00A10FD9"/>
+    <w:pPr>
+      <w:keepNext/>
+      <w:keepLines/>
+      <w:spacing w:before="40" w:after="0"/>
+      <w:outlineLvl w:val="5"/>
+    </w:pPr>
+    <w:rPr>
+      <w:rFonts w:eastAsiaTheme="majorEastAsia" w:cstheme="majorBidi"/>
+      <w:i/>
+      <w:iCs/>
+      <w:color w:val="595959" w:themeColor="text1" w:themeTint="A6"/>
+    </w:rPr>
+  </w:style>
+  <w:style w:type="paragraph" w:styleId="Heading7">
+    <w:name w:val="heading 7"/>
+    <w:basedOn w:val="Normal"/>
+    <w:next w:val="BodyText"/>
+    <w:link w:val="Heading7Char"/>
+    <w:uiPriority w:val="9"/>
+    <w:semiHidden/>
+    <w:unhideWhenUsed/>
+    <w:qFormat/>
+    <w:rsid w:val="00A10FD9"/>
+    <w:pPr>
+      <w:keepNext/>
+      <w:keepLines/>
+      <w:spacing w:before="40" w:after="0"/>
+      <w:outlineLvl w:val="6"/>
+    </w:pPr>
+    <w:rPr>
+      <w:rFonts w:eastAsiaTheme="majorEastAsia" w:cstheme="majorBidi"/>
+      <w:color w:val="595959" w:themeColor="text1" w:themeTint="A6"/>
+    </w:rPr>
+  </w:style>
+  <w:style w:type="paragraph" w:styleId="Heading8">
+    <w:name w:val="heading 8"/>
+    <w:basedOn w:val="Normal"/>
+    <w:next w:val="BodyText"/>
+    <w:link w:val="Heading8Char"/>
+    <w:uiPriority w:val="9"/>
+    <w:semiHidden/>
+    <w:unhideWhenUsed/>
+    <w:qFormat/>
+    <w:rsid w:val="00A10FD9"/>
+    <w:pPr>
+      <w:keepNext/>
+      <w:keepLines/>
+      <w:spacing w:after="0"/>
+      <w:outlineLvl w:val="7"/>
+    </w:pPr>
+    <w:rPr>
+      <w:rFonts w:eastAsiaTheme="majorEastAsia" w:cstheme="majorBidi"/>
+      <w:i/>
+      <w:iCs/>
+      <w:color w:val="272727" w:themeColor="text1" w:themeTint="D8"/>
+    </w:rPr>
+  </w:style>
+  <w:style w:type="paragraph" w:styleId="Heading9">
+    <w:name w:val="heading 9"/>
+    <w:basedOn w:val="Normal"/>
+    <w:next w:val="BodyText"/>
+    <w:link w:val="Heading9Char"/>
+    <w:uiPriority w:val="9"/>
+    <w:semiHidden/>
+    <w:unhideWhenUsed/>
+    <w:qFormat/>
+    <w:rsid w:val="00A10FD9"/>
+    <w:pPr>
+      <w:keepNext/>
+      <w:keepLines/>
+      <w:spacing w:after="0"/>
+      <w:outlineLvl w:val="8"/>
+    </w:pPr>
+    <w:rPr>
+      <w:rFonts w:eastAsiaTheme="majorEastAsia" w:cstheme="majorBidi"/>
+      <w:color w:val="272727" w:themeColor="text1" w:themeTint="D8"/>
+    </w:rPr>
+  </w:style>
+  <w:style w:type="character" w:customStyle="1" w:styleId="Heading1Char">
+    <w:name w:val="Heading 1 Char"/>
+    <w:basedOn w:val="DefaultParagraphFont"/>
+    <w:link w:val="Heading1"/>
+    <w:uiPriority w:val="9"/>
+    <w:rsid w:val="00A10FD9"/>
+    <w:rPr>
+      <w:rFonts w:asciiTheme="majorHAnsi" w:eastAsiaTheme="majorEastAsia" w:hAnsiTheme="majorHAnsi" w:cstheme="majorBidi"/>
+      <w:color w:val="0F4761" w:themeColor="accent1" w:themeShade="BF"/>
+      <w:sz w:val="40"/>
+      <w:szCs w:val="40"/>
+    </w:rPr>
+  </w:style>
+  <w:style w:type="character" w:customStyle="1" w:styleId="Heading2Char">
+    <w:name w:val="Heading 2 Char"/>
+    <w:basedOn w:val="DefaultParagraphFont"/>
+    <w:link w:val="Heading2"/>
+    <w:uiPriority w:val="9"/>
+    <w:semiHidden/>
+    <w:rsid w:val="00A10FD9"/>
+    <w:rPr>
+      <w:rFonts w:asciiTheme="majorHAnsi" w:eastAsiaTheme="majorEastAsia" w:hAnsiTheme="majorHAnsi" w:cstheme="majorBidi"/>
+      <w:color w:val="0F4761" w:themeColor="accent1" w:themeShade="BF"/>
+      <w:sz w:val="32"/>
+      <w:szCs w:val="32"/>
+    </w:rPr>
+  </w:style>
+  <w:style w:type="character" w:customStyle="1" w:styleId="Heading3Char">
+    <w:name w:val="Heading 3 Char"/>
+    <w:basedOn w:val="DefaultParagraphFont"/>
+    <w:link w:val="Heading3"/>
+    <w:uiPriority w:val="9"/>
+    <w:semiHidden/>
+    <w:rsid w:val="00A10FD9"/>
+    <w:rPr>
+      <w:rFonts w:eastAsiaTheme="majorEastAsia" w:cstheme="majorBidi"/>
+      <w:color w:val="0F4761" w:themeColor="accent1" w:themeShade="BF"/>
+      <w:sz w:val="28"/>
+      <w:szCs w:val="28"/>
+    </w:rPr>
+  </w:style>
+  <w:style w:type="character" w:customStyle="1" w:styleId="Heading4Char">
+    <w:name w:val="Heading 4 Char"/>
+    <w:basedOn w:val="DefaultParagraphFont"/>
+    <w:link w:val="Heading4"/>
+    <w:uiPriority w:val="9"/>
+    <w:semiHidden/>
+    <w:rsid w:val="00A10FD9"/>
+    <w:rPr>
+      <w:rFonts w:eastAsiaTheme="majorEastAsia" w:cstheme="majorBidi"/>
+      <w:i/>
+      <w:iCs/>
+      <w:color w:val="0F4761" w:themeColor="accent1" w:themeShade="BF"/>
+    </w:rPr>
+  </w:style>
+  <w:style w:type="character" w:customStyle="1" w:styleId="Heading5Char">
+    <w:name w:val="Heading 5 Char"/>
+    <w:basedOn w:val="DefaultParagraphFont"/>
+    <w:link w:val="Heading5"/>
+    <w:uiPriority w:val="9"/>
+    <w:semiHidden/>
+    <w:rsid w:val="00A10FD9"/>
+    <w:rPr>
+      <w:rFonts w:eastAsiaTheme="majorEastAsia" w:cstheme="majorBidi"/>
+      <w:color w:val="0F4761" w:themeColor="accent1" w:themeShade="BF"/>
+    </w:rPr>
+  </w:style>
+  <w:style w:type="character" w:customStyle="1" w:styleId="Heading6Char">
+    <w:name w:val="Heading 6 Char"/>
+    <w:basedOn w:val="DefaultParagraphFont"/>
+    <w:link w:val="Heading6"/>
+    <w:uiPriority w:val="9"/>
+    <w:semiHidden/>
+    <w:rsid w:val="00A10FD9"/>
+    <w:rPr>
+      <w:rFonts w:eastAsiaTheme="majorEastAsia" w:cstheme="majorBidi"/>
+      <w:i/>
+      <w:iCs/>
+      <w:color w:val="595959" w:themeColor="text1" w:themeTint="A6"/>
+    </w:rPr>
+  </w:style>
+  <w:style w:type="character" w:customStyle="1" w:styleId="Heading7Char">
+    <w:name w:val="Heading 7 Char"/>
+    <w:basedOn w:val="DefaultParagraphFont"/>
+    <w:link w:val="Heading7"/>
+    <w:uiPriority w:val="9"/>
+    <w:semiHidden/>
+    <w:rsid w:val="00A10FD9"/>
+    <w:rPr>
+      <w:rFonts w:eastAsiaTheme="majorEastAsia" w:cstheme="majorBidi"/>
+      <w:color w:val="595959" w:themeColor="text1" w:themeTint="A6"/>
+    </w:rPr>
+  </w:style>
+  <w:style w:type="character" w:customStyle="1" w:styleId="Heading8Char">
+    <w:name w:val="Heading 8 Char"/>
+    <w:basedOn w:val="DefaultParagraphFont"/>
+    <w:link w:val="Heading8"/>
+    <w:uiPriority w:val="9"/>
+    <w:semiHidden/>
+    <w:rsid w:val="00A10FD9"/>
+    <w:rPr>
+      <w:rFonts w:eastAsiaTheme="majorEastAsia" w:cstheme="majorBidi"/>
+      <w:i/>
+      <w:iCs/>
+      <w:color w:val="272727" w:themeColor="text1" w:themeTint="D8"/>
+    </w:rPr>
+  </w:style>
+  <w:style w:type="character" w:customStyle="1" w:styleId="Heading9Char">
+    <w:name w:val="Heading 9 Char"/>
+    <w:basedOn w:val="DefaultParagraphFont"/>
+    <w:link w:val="Heading9"/>
+    <w:uiPriority w:val="9"/>
+    <w:semiHidden/>
+    <w:rsid w:val="00A10FD9"/>
+    <w:rPr>
+      <w:rFonts w:eastAsiaTheme="majorEastAsia" w:cstheme="majorBidi"/>
+      <w:color w:val="272727" w:themeColor="text1" w:themeTint="D8"/>
+    </w:rPr>
+  </w:style>
+  <w:style w:type="paragraph" w:customStyle="1" w:styleId="ListItem">
+    <w:name w:val="List Item"/>
+    <w:basedOn w:val="BodyText"/>
+    <w:qFormat/>
+    <w:pPr>
+      <w:spacing w:before="0" w:after="0" w:line="640" w:lineRule="exact"/>
+      <w:ind w:left="720" w:hanging="720"/>
+    </w:pPr>
+  </w:style>
+  <w:style w:type="paragraph" w:styleId="BlockText">
+    <w:name w:val="Block Text"/>
+    <w:basedOn w:val="BodyText"/>
+    <w:next w:val="BodyText"/>
+    <w:uiPriority w:val="9"/>
+    <w:unhideWhenUsed/>
+    <w:qFormat/>
+    <w:pPr>
+      <w:spacing w:before="280" w:after="280" w:line="320" w:lineRule="exact"/>
+      <w:ind w:firstLine="0" w:left="720" w:right="720"/>
+    </w:pPr>
+  </w:style>
+  <w:style w:type="paragraph" w:styleId="FootnoteText">
+    <w:name w:val="Footnote Text"/>
+    <w:basedOn w:val="Normal"/>
+    <w:next w:val="FootnoteText"/>
+    <w:uiPriority w:val="9"/>
+    <w:unhideWhenUsed/>
+    <w:qFormat/>
+    <w:pPr>
+      <w:keepLines/>
+      <w:spacing w:before="0" w:after="140" w:line="320" w:lineRule="exact"/>
+    </w:pPr>
+    <w:rPr>
+      <w:sz w:val="28"/>
+      <w:szCs w:val="28"/>
+    </w:rPr>
+  </w:style>
+  <w:style w:type="paragraph" w:styleId="FootnoteBlockText">
+    <w:name w:val="Footnote Block Text"/>
+    <w:basedOn w:val="FootnoteText"/>
+    <w:next w:val="FootnoteText"/>
+    <w:uiPriority w:val="9"/>
+    <w:unhideWhenUsed/>
+    <w:qFormat/>
+    <w:pPr>
+      <w:spacing w:before="280" w:after="280"/>
+      <w:ind w:firstLine="0" w:left="720" w:right="720"/>
     </w:pPr>
   </w:style>
   <w:style w:type="character" w:default="1" w:styleId="DefaultParagraphFont">
     <w:name w:val="Default Paragraph Font"/>
-    <w:uiPriority w:val="1"/>
     <w:semiHidden/>
     <w:unhideWhenUsed/>
   </w:style>
-  <w:style w:type="table" w:default="1" w:styleId="TableNormal">
-    <w:name w:val="Normal Table"/>
-    <w:uiPriority w:val="99"/>
-    <w:semiHidden/>
-    <w:unhideWhenUsed/>
+  <w:style w:type="table" w:default="1" w:styleId="Table">
+    <w:name w:val="Table"/>
+    <w:basedOn w:val="TableNormal"/>
+    <w:qFormat/>
     <w:tblPr>
       <w:tblInd w:w="0" w:type="dxa"/>
       <w:tblCellMar>
@@ -580,329 +1091,122 @@
         <w:right w:w="108" w:type="dxa"/>
       </w:tblCellMar>
     </w:tblPr>
-  </w:style>
-  <w:style w:type="numbering" w:default="1" w:styleId="NoList">
-    <w:name w:val="No List"/>
-    <w:uiPriority w:val="99"/>
-    <w:semiHidden/>
-    <w:unhideWhenUsed/>
-  </w:style>
-  <!-- Body text: double spaced, first line indented 0.5 in (the typst para-indent). Left aligned, as the typst template. -->
-  <w:style w:type="paragraph" w:styleId="BodyText">
-    <w:name w:val="Body Text"/>
-    <w:basedOn w:val="Normal"/>
-    <w:qFormat/>
-    <w:pPr>
-      <w:spacing w:before="0" w:after="0" w:line="480" w:lineRule="auto"/>
-      <w:ind w:firstLine="720"/>
-      <w:jc w:val="left"/>
-    </w:pPr>
-  </w:style>
-  <w:style w:type="paragraph" w:styleId="FirstParagraph">
-    <w:name w:val="First Paragraph"/>
-    <w:basedOn w:val="BodyText"/>
-    <w:next w:val="BodyText"/>
-    <w:qFormat/>
-    <w:pPr>
-      <w:spacing w:before="0" w:after="0" w:line="480" w:lineRule="auto"/>
-      <w:ind w:firstLine="720"/>
-    </w:pPr>
-  </w:style>
-  <w:style w:type="paragraph" w:styleId="Compact">
-    <w:name w:val="Compact"/>
-    <w:basedOn w:val="BodyText"/>
-    <w:qFormat/>
-    <w:pPr>
-      <w:spacing w:before="0" w:after="0" w:line="480" w:lineRule="auto"/>
-      <w:ind w:firstLine="0"/>
-    </w:pPr>
-  </w:style>
-  <!-- The conclusion stays on the page of the signature block (typst: block(breakable: false)). -->
-  <w:style w:type="paragraph" w:customStyle="1" w:styleId="BodyKeepNext">
-    <w:name w:val="Body Keep Next"/>
-    <w:basedOn w:val="BodyText"/>
-    <w:next w:val="SignatureBlock"/>
-    <w:qFormat/>
+    <w:tblStylePr w:type="firstRow">
+      <w:tcPr>
+        <w:tcBorders>
+          <w:bottom w:val="single"/>
+        </w:tcBorders>
+        <w:vAlign w:val="bottom"/>
+      </w:tcPr>
+    </w:tblStylePr>
+  </w:style>
+  <w:style w:type="paragraph" w:customStyle="1" w:styleId="DefinitionTerm">
+    <w:name w:val="Definition Term"/>
+    <w:basedOn w:val="Normal"/>
+    <w:next w:val="Definition"/>
     <w:pPr>
       <w:keepNext/>
       <w:keepLines/>
-    </w:pPr>
-  </w:style>
-  <!-- Block quotations: indented from both margins, 1.5 spaced (42.6(a)(2)(iii)). -->
-  <w:style w:type="paragraph" w:styleId="BlockText">
-    <w:name w:val="Block Text"/>
-    <w:basedOn w:val="Normal"/>
-    <w:next w:val="BodyText"/>
-    <w:qFormat/>
-    <w:pPr>
-      <w:spacing w:before="160" w:after="240" w:line="360" w:lineRule="auto"/>
-      <w:ind w:left="720" w:right="720" w:firstLine="0"/>
-      <w:jc w:val="left"/>
-    </w:pPr>
-  </w:style>
-  <!-- Headings: numbered from list 901 (I., A., 1., a.). Level 1 centered in capitals; levels 2 and 3 flush left, bold. -->
-  <w:style w:type="paragraph" w:styleId="Heading1">
-    <w:name w:val="heading 1"/>
-    <w:basedOn w:val="Normal"/>
-    <w:next w:val="BodyText"/>
-    <w:uiPriority w:val="9"/>
-    <w:qFormat/>
-    <w:pPr>
-      <w:keepNext/>
-      <w:keepLines/>
-      <w:numPr>
-        <w:ilvl w:val="0"/>
-        <w:numId w:val="901"/>
-      </w:numPr>
-      <w:spacing w:before="240" w:after="240" w:line="240" w:lineRule="auto"/>
-      <w:jc w:val="center"/>
-      <w:outlineLvl w:val="0"/>
+      <w:spacing w:after="0"/>
     </w:pPr>
     <w:rPr>
       <w:b/>
-      <w:bCs/>
-      <w:caps/>
-    </w:rPr>
-  </w:style>
-  <w:style w:type="paragraph" w:styleId="Heading2">
-    <w:name w:val="heading 2"/>
-    <w:basedOn w:val="Normal"/>
-    <w:next w:val="BodyText"/>
-    <w:uiPriority w:val="9"/>
-    <w:qFormat/>
-    <w:pPr>
-      <w:keepNext/>
-      <w:keepLines/>
-      <w:numPr>
-        <w:ilvl w:val="1"/>
-        <w:numId w:val="901"/>
-      </w:numPr>
-      <w:spacing w:before="240" w:after="240" w:line="240" w:lineRule="auto"/>
-      <w:jc w:val="left"/>
-      <w:outlineLvl w:val="1"/>
-    </w:pPr>
-    <w:rPr>
-      <w:b/>
-      <w:bCs/>
-    </w:rPr>
-  </w:style>
-  <w:style w:type="paragraph" w:styleId="Heading3">
-    <w:name w:val="heading 3"/>
-    <w:basedOn w:val="Normal"/>
-    <w:next w:val="BodyText"/>
-    <w:uiPriority w:val="9"/>
-    <w:qFormat/>
-    <w:pPr>
-      <w:keepNext/>
-      <w:keepLines/>
-      <w:numPr>
-        <w:ilvl w:val="2"/>
-        <w:numId w:val="901"/>
-      </w:numPr>
-      <w:spacing w:before="240" w:after="240" w:line="240" w:lineRule="auto"/>
-      <w:jc w:val="left"/>
-      <w:outlineLvl w:val="2"/>
-    </w:pPr>
-    <w:rPr>
-      <w:b/>
-      <w:bCs/>
+    </w:rPr>
+  </w:style>
+  <w:style w:type="paragraph" w:customStyle="1" w:styleId="Definition">
+    <w:name w:val="Definition"/>
+    <w:basedOn w:val="Normal"/>
+  </w:style>
+  <w:style w:type="paragraph" w:styleId="Caption">
+    <w:name w:val="Caption"/>
+    <w:basedOn w:val="Normal"/>
+    <w:link w:val="BodyTextChar"/>
+    <w:pPr>
+      <w:spacing w:before="0" w:after="120"/>
+    </w:pPr>
+    <w:rPr>
       <w:i/>
-      <w:iCs/>
-    </w:rPr>
-  </w:style>
-  <!-- Cover, contents, signature, certificates: single spaced, no first-line indent. -->
-  <w:style w:type="paragraph" w:customStyle="1" w:styleId="CenteredHeading">
-    <w:name w:val="Centered Heading"/>
-    <w:basedOn w:val="Normal"/>
-    <w:next w:val="BodyText"/>
-    <w:qFormat/>
-    <w:pPr>
-      <w:keepNext/>
-      <w:keepLines/>
-      <w:spacing w:before="0" w:after="240" w:line="240" w:lineRule="auto"/>
-      <w:jc w:val="center"/>
-    </w:pPr>
-    <w:rPr>
-      <w:b/>
-      <w:bCs/>
-    </w:rPr>
-  </w:style>
-  <w:style w:type="paragraph" w:customStyle="1" w:styleId="SingleLine">
-    <w:name w:val="Single Line"/>
-    <w:basedOn w:val="Normal"/>
-    <w:qFormat/>
-    <w:pPr>
-      <w:spacing w:before="0" w:after="0" w:line="240" w:lineRule="auto"/>
-      <w:ind w:firstLine="0"/>
-      <w:jc w:val="left"/>
-    </w:pPr>
-  </w:style>
-  <w:style w:type="paragraph" w:customStyle="1" w:styleId="CoverCenter">
-    <w:name w:val="Cover Center"/>
-    <w:basedOn w:val="SingleLine"/>
-    <w:qFormat/>
-    <w:pPr>
-      <w:jc w:val="center"/>
-    </w:pPr>
-  </w:style>
-  <w:style w:type="paragraph" w:customStyle="1" w:styleId="CoverRight">
-    <w:name w:val="Cover Right"/>
-    <w:basedOn w:val="SingleLine"/>
-    <w:qFormat/>
-    <w:pPr>
-      <w:jc w:val="right"/>
-    </w:pPr>
-  </w:style>
-  <w:style w:type="paragraph" w:customStyle="1" w:styleId="SignatureBlock">
-    <w:name w:val="Signature Block"/>
-    <w:basedOn w:val="SingleLine"/>
-    <w:qFormat/>
-    <w:pPr>
-      <w:keepLines/>
-      <w:jc w:val="right"/>
-    </w:pPr>
-  </w:style>
-  <w:style w:type="paragraph" w:customStyle="1" w:styleId="CertificateText">
-    <w:name w:val="Certificate Text"/>
-    <w:basedOn w:val="BodyText"/>
-    <w:qFormat/>
-    <w:pPr>
-      <w:spacing w:before="0" w:after="0" w:line="480" w:lineRule="auto"/>
-      <w:ind w:firstLine="720"/>
-    </w:pPr>
-  </w:style>
-  <w:style w:type="paragraph" w:customStyle="1" w:styleId="ServiceRecipient">
-    <w:name w:val="Service Recipient"/>
-    <w:basedOn w:val="SingleLine"/>
-    <w:qFormat/>
-    <w:pPr>
-      <w:keepLines/>
-      <w:spacing w:before="240" w:after="0" w:line="240" w:lineRule="auto"/>
-      <w:ind w:left="720"/>
-    </w:pPr>
-  </w:style>
-  <!-- Footnotes: 14 pt, single spaced. -->
-  <w:style w:type="paragraph" w:styleId="FootnoteText">
-    <w:name w:val="footnote text"/>
-    <w:basedOn w:val="Normal"/>
-    <w:uiPriority w:val="99"/>
-    <w:unhideWhenUsed/>
-    <w:pPr>
-      <w:spacing w:before="0" w:after="120" w:line="240" w:lineRule="auto"/>
-      <w:ind w:firstLine="0"/>
-    </w:pPr>
-    <w:rPr>
-      <w:sz w:val="28"/>
-      <w:szCs w:val="28"/>
-    </w:rPr>
+    </w:rPr>
+  </w:style>
+  <w:style w:type="paragraph" w:customStyle="1" w:styleId="TableCaption">
+    <w:name w:val="Table Caption"/>
+    <w:basedOn w:val="Caption"/>
+    <w:pPr>
+      <w:keepNext/>
+    </w:pPr>
+  </w:style>
+  <w:style w:type="paragraph" w:customStyle="1" w:styleId="ImageCaption">
+    <w:name w:val="Image Caption"/>
+    <w:basedOn w:val="Caption"/>
+  </w:style>
+  <w:style w:type="paragraph" w:customStyle="1" w:styleId="Figure">
+    <w:name w:val="Figure"/>
+    <w:basedOn w:val="Normal"/>
+  </w:style>
+  <w:style w:type="paragraph" w:customStyle="1" w:styleId="CaptionedFigure">
+    <w:name w:val="Captioned Figure"/>
+    <w:basedOn w:val="Figure"/>
+    <w:pPr>
+      <w:keepNext/>
+    </w:pPr>
+  </w:style>
+  <w:style w:type="character" w:customStyle="1" w:styleId="BodyTextChar">
+    <w:name w:val="Body Text Char"/>
+    <w:basedOn w:val="DefaultParagraphFont"/>
+    <w:link w:val="BodyText"/>
+  </w:style>
+  <w:style w:type="character" w:customStyle="1" w:styleId="VerbatimChar">
+    <w:name w:val="Verbatim Char"/>
+    <w:basedOn w:val="BodyTextChar"/>
+    <w:rPr>
+      <w:rFonts w:ascii="Consolas" w:hAnsi="Consolas"/>
+      <w:sz w:val="22"/>
+    </w:rPr>
+  </w:style>
+  <w:style w:type="character" w:customStyle="1" w:styleId="SectionNumber">
+    <w:name w:val="Section Number"/>
+    <w:basedOn w:val="BodyTextChar"/>
   </w:style>
   <w:style w:type="character" w:styleId="FootnoteReference">
-    <w:name w:val="footnote reference"/>
-    <w:basedOn w:val="DefaultParagraphFont"/>
-    <w:uiPriority w:val="99"/>
-    <w:unhideWhenUsed/>
+    <w:name w:val="Footnote Reference"/>
+    <w:basedOn w:val="BodyTextChar"/>
     <w:rPr>
       <w:vertAlign w:val="superscript"/>
     </w:rPr>
   </w:style>
-  <!-- Contents (TOC field entries). -->
-  <w:style w:type="paragraph" w:styleId="TOC1">
-    <w:name w:val="toc 1"/>
-    <w:basedOn w:val="Normal"/>
-    <w:next w:val="Normal"/>
+  <w:style w:type="character" w:styleId="Hyperlink">
+    <w:name w:val="Hyperlink"/>
+    <w:basedOn w:val="BodyTextChar"/>
+    <w:rPr>
+      <w:color w:val="000000"/>
+    </w:rPr>
+  </w:style>
+  <w:style w:type="paragraph" w:styleId="TOCHeading">
+    <w:name w:val="TOC Heading"/>
+    <w:basedOn w:val="Heading1"/>
+    <w:next w:val="BodyText"/>
     <w:uiPriority w:val="39"/>
     <w:unhideWhenUsed/>
-    <w:pPr>
+    <w:qFormat/>
+    <w:pPr>
+      <w:spacing w:before="240" w:line="259" w:lineRule="auto"/>
+      <w:outlineLvl w:val="9"/>
+    </w:pPr>
+    <w:rPr>
+      <w:rFonts w:asciiTheme="majorHAnsi" w:eastAsiaTheme="majorEastAsia" w:hAnsiTheme="majorHAnsi" w:cstheme="majorBidi"/>
+      <w:b w:val="0"/>
+      <w:bCs w:val="0"/>
+      <w:color w:val="365F91" w:themeColor="accent1" w:themeShade="BF"/>
+    </w:rPr>
+  </w:style>
+  <w:style w:type="paragraph" w:customStyle="1" w:styleId="BodyKeep">
+    <w:name w:val="Body Keep"/>
+    <w:basedOn w:val="BodyText"/>
+    <w:qFormat/>
+    <w:pPr>
+      <w:keepNext/>
       <w:keepLines/>
-      <w:spacing w:before="200" w:after="0" w:line="240" w:lineRule="auto"/>
-      <w:ind w:left="0" w:right="720"/>
-    </w:pPr>
-  </w:style>
-  <w:style w:type="paragraph" w:styleId="TOC2">
-    <w:name w:val="toc 2"/>
-    <w:basedOn w:val="Normal"/>
-    <w:next w:val="Normal"/>
-    <w:uiPriority w:val="39"/>
-    <w:unhideWhenUsed/>
-    <w:pPr>
-      <w:keepLines/>
-      <w:spacing w:before="140" w:after="0" w:line="240" w:lineRule="auto"/>
-      <w:ind w:left="720" w:right="720"/>
-    </w:pPr>
-  </w:style>
-  <w:style w:type="paragraph" w:styleId="Header">
-    <w:name w:val="header"/>
-    <w:basedOn w:val="Normal"/>
-    <w:uiPriority w:val="99"/>
-    <w:unhideWhenUsed/>
-    <w:pPr>
-      <w:tabs>
-        <w:tab w:val="center" w:pos="4680"/>
-        <w:tab w:val="right" w:pos="9360"/>
-      </w:tabs>
-      <w:spacing w:before="0" w:after="0" w:line="240" w:lineRule="auto"/>
-      <w:jc w:val="right"/>
-    </w:pPr>
-  </w:style>
-  <w:style w:type="paragraph" w:styleId="Footer">
-    <w:name w:val="footer"/>
-    <w:basedOn w:val="Normal"/>
-    <w:uiPriority w:val="99"/>
-    <w:unhideWhenUsed/>
-    <w:pPr>
-      <w:tabs>
-        <w:tab w:val="center" w:pos="4680"/>
-        <w:tab w:val="right" w:pos="9360"/>
-      </w:tabs>
-      <w:spacing w:before="0" w:after="0" w:line="240" w:lineRule="auto"/>
-      <w:jc w:val="center"/>
-    </w:pPr>
-  </w:style>
-  <w:style w:type="character" w:styleId="Hyperlink">
-    <w:name w:val="Hyperlink"/>
-    <w:basedOn w:val="DefaultParagraphFont"/>
-    <w:uiPriority w:val="99"/>
-    <w:unhideWhenUsed/>
-    <w:rPr>
-      <w:color w:val="000000"/>
-    </w:rPr>
-  </w:style>
-  <w:style w:type="character" w:styleId="Strong">
-    <w:name w:val="Strong"/>
-    <w:basedOn w:val="DefaultParagraphFont"/>
-    <w:qFormat/>
-    <w:rPr>
-      <w:b/>
-      <w:bCs/>
-    </w:rPr>
-  </w:style>
-  <w:style w:type="character" w:styleId="Emphasis">
-    <w:name w:val="Emphasis"/>
-    <w:basedOn w:val="DefaultParagraphFont"/>
-    <w:qFormat/>
-    <w:rPr>
-      <w:i/>
-      <w:iCs/>
-    </w:rPr>
-  </w:style>
-  <w:style w:type="table" w:styleId="Table">
-    <w:name w:val="Table"/>
-    <w:basedOn w:val="TableNormal"/>
-    <w:uiPriority w:val="59"/>
-    <w:tblPr>
-      <w:tblBorders>
-        <w:top w:val="nil"/>
-        <w:left w:val="nil"/>
-        <w:bottom w:val="nil"/>
-        <w:right w:val="nil"/>
-        <w:insideH w:val="nil"/>
-        <w:insideV w:val="nil"/>
-      </w:tblBorders>
-      <w:tblCellMar>
-        <w:left w:w="0" w:type="dxa"/>
-        <w:right w:w="0" w:type="dxa"/>
-      </w:tblCellMar>
-    </w:tblPr>
+    </w:pPr>
   </w:style>
 </w:styles>
 </file>

</xml_diff>